<commit_message>
fix: OUTPUT_PATH をLinux環境に修正、numpy.trapz → trapezoid 互換対応
- OUTPUT_PATH を /Users/takaoka → /home/user に修正
- NumPy 2.x で廃止された trapz を trapezoid にフォールバック対応
- report_final.docx を再生成（4章構成・245段落・6表・516KB）

https://claude.ai/code/session_01FPX46s2ySJiFJFnpwADRHY
</commit_message>
<xml_diff>
--- a/report_final.docx
+++ b/report_final.docx
@@ -7222,7 +7222,7 @@
       <w:r>
         <w:drawing>
           <wp:inline xmlns:a="http://schemas.openxmlformats.org/drawingml/2006/main" xmlns:pic="http://schemas.openxmlformats.org/drawingml/2006/picture">
-            <wp:extent cx="3960000" cy="2800039"/>
+            <wp:extent cx="3960000" cy="2801163"/>
             <wp:docPr id="1" name="Picture 1"/>
             <wp:cNvGraphicFramePr>
               <a:graphicFrameLocks noChangeAspect="1"/>
@@ -7243,7 +7243,7 @@
                   <pic:spPr>
                     <a:xfrm>
                       <a:off x="0" y="0"/>
-                      <a:ext cx="3960000" cy="2800039"/>
+                      <a:ext cx="3960000" cy="2801163"/>
                     </a:xfrm>
                     <a:prstGeom prst="rect"/>
                   </pic:spPr>
@@ -7912,7 +7912,7 @@
       <w:r>
         <w:drawing>
           <wp:inline xmlns:a="http://schemas.openxmlformats.org/drawingml/2006/main" xmlns:pic="http://schemas.openxmlformats.org/drawingml/2006/picture">
-            <wp:extent cx="5040000" cy="2998868"/>
+            <wp:extent cx="5040000" cy="2992713"/>
             <wp:docPr id="2" name="Picture 2"/>
             <wp:cNvGraphicFramePr>
               <a:graphicFrameLocks noChangeAspect="1"/>
@@ -7933,7 +7933,7 @@
                   <pic:spPr>
                     <a:xfrm>
                       <a:off x="0" y="0"/>
-                      <a:ext cx="5040000" cy="2998868"/>
+                      <a:ext cx="5040000" cy="2992713"/>
                     </a:xfrm>
                     <a:prstGeom prst="rect"/>
                   </pic:spPr>
@@ -8012,7 +8012,7 @@
       <w:r>
         <w:drawing>
           <wp:inline xmlns:a="http://schemas.openxmlformats.org/drawingml/2006/main" xmlns:pic="http://schemas.openxmlformats.org/drawingml/2006/picture">
-            <wp:extent cx="5400000" cy="2195886"/>
+            <wp:extent cx="5400000" cy="2194729"/>
             <wp:docPr id="3" name="Picture 3"/>
             <wp:cNvGraphicFramePr>
               <a:graphicFrameLocks noChangeAspect="1"/>
@@ -8033,7 +8033,7 @@
                   <pic:spPr>
                     <a:xfrm>
                       <a:off x="0" y="0"/>
-                      <a:ext cx="5400000" cy="2195886"/>
+                      <a:ext cx="5400000" cy="2194729"/>
                     </a:xfrm>
                     <a:prstGeom prst="rect"/>
                   </pic:spPr>
@@ -8112,7 +8112,7 @@
       <w:r>
         <w:drawing>
           <wp:inline xmlns:a="http://schemas.openxmlformats.org/drawingml/2006/main" xmlns:pic="http://schemas.openxmlformats.org/drawingml/2006/picture">
-            <wp:extent cx="5400000" cy="2195886"/>
+            <wp:extent cx="5400000" cy="2194729"/>
             <wp:docPr id="4" name="Picture 4"/>
             <wp:cNvGraphicFramePr>
               <a:graphicFrameLocks noChangeAspect="1"/>
@@ -8133,7 +8133,7 @@
                   <pic:spPr>
                     <a:xfrm>
                       <a:off x="0" y="0"/>
-                      <a:ext cx="5400000" cy="2195886"/>
+                      <a:ext cx="5400000" cy="2194729"/>
                     </a:xfrm>
                     <a:prstGeom prst="rect"/>
                   </pic:spPr>
@@ -8212,7 +8212,7 @@
       <w:r>
         <w:drawing>
           <wp:inline xmlns:a="http://schemas.openxmlformats.org/drawingml/2006/main" xmlns:pic="http://schemas.openxmlformats.org/drawingml/2006/picture">
-            <wp:extent cx="5400000" cy="2195886"/>
+            <wp:extent cx="5400000" cy="2194729"/>
             <wp:docPr id="5" name="Picture 5"/>
             <wp:cNvGraphicFramePr>
               <a:graphicFrameLocks noChangeAspect="1"/>
@@ -8233,7 +8233,7 @@
                   <pic:spPr>
                     <a:xfrm>
                       <a:off x="0" y="0"/>
-                      <a:ext cx="5400000" cy="2195886"/>
+                      <a:ext cx="5400000" cy="2194729"/>
                     </a:xfrm>
                     <a:prstGeom prst="rect"/>
                   </pic:spPr>
@@ -13283,7 +13283,7 @@
       <w:r>
         <w:drawing>
           <wp:inline xmlns:a="http://schemas.openxmlformats.org/drawingml/2006/main" xmlns:pic="http://schemas.openxmlformats.org/drawingml/2006/picture">
-            <wp:extent cx="5040000" cy="2994093"/>
+            <wp:extent cx="5040000" cy="2989312"/>
             <wp:docPr id="6" name="Picture 6"/>
             <wp:cNvGraphicFramePr>
               <a:graphicFrameLocks noChangeAspect="1"/>
@@ -13304,7 +13304,7 @@
                   <pic:spPr>
                     <a:xfrm>
                       <a:off x="0" y="0"/>
-                      <a:ext cx="5040000" cy="2994093"/>
+                      <a:ext cx="5040000" cy="2989312"/>
                     </a:xfrm>
                     <a:prstGeom prst="rect"/>
                   </pic:spPr>

</xml_diff>